<commit_message>
actualice post de instalacion de miniconda
</commit_message>
<xml_diff>
--- a/_site/python/2020-06-19-instalacion-de-anaconda/index.docx
+++ b/_site/python/2020-06-19-instalacion-de-anaconda/index.docx
@@ -202,7 +202,7 @@
         <w:pStyle w:val="AbstractFirstParagraph"/>
       </w:pPr>
       <w:r>
-        <w:t xml:space="preserve">Este abstract será actualizado una vez que se complete el contenido final del artículo.</w:t>
+        <w:t xml:space="preserve">Esta publicación detalla el proceso de instalación y configuración óptima de Miniconda (en lugar de la distribución completa de Anaconda) en sistemas Linux (con énfasis en Arch Linux), orientada a usuarios avanzados, economistas, investigadores y desarrolladores que trabajan con múltiples proyectos de ciencia de datos, econometría y publicación académica mediante Quarto. Se explican paso a paso; la preparación del sistema, instalación silenciosa o interactiva, configuración inicial con desactivación de auto-activación del entorno base, integración acelerada mediante Mamba, configuración recomendada del archivo .condarc, personalización del shell Fish, aliases útiles para flujos de trabajo con múltiples blogs/proyectos, integración con herramientas del sistema (Quarto, R y LaTeX) y resolución de problemas frecuentes. El enfoque prioriza ligereza (~50 MB), control total, reproducibilidad mediante environment.yml y máxima velocidad de instalación/resolución de dependencias.</w:t>
       </w:r>
     </w:p>
     <w:p>
@@ -217,7 +217,7 @@
         <w:t xml:space="preserve">Palabras clave</w:t>
       </w:r>
       <w:r>
-        <w:t xml:space="preserve">: keyword1, keyword2</w:t>
+        <w:t xml:space="preserve">: Miniconda, Mamba, Entornos conda</w:t>
       </w:r>
     </w:p>
     <w:p>
@@ -617,7 +617,7 @@
         <w:t xml:space="preserve"> </w:t>
       </w:r>
       <w:r>
-        <w:t xml:space="preserve">Ideal para tus 10+ blogs con dependencias diferentes</w:t>
+        <w:t xml:space="preserve">Ideal para mis 10+ blogs con dependencias diferentes</w:t>
       </w:r>
     </w:p>
     <w:p>
@@ -808,13 +808,13 @@
       </w:r>
     </w:p>
     <w:bookmarkEnd w:id="31"/>
-    <w:bookmarkStart w:id="32" w:name="Xeeff58c96b2b4bb7fd34514900839d791719209"/>
+    <w:bookmarkStart w:id="32" w:name="desinstalar-instalaciones-previas"/>
     <w:p>
       <w:pPr>
         <w:pStyle w:val="Heading2"/>
       </w:pPr>
       <w:r>
-        <w:t xml:space="preserve">3.2 2. Desinstalar Instalaciones Previas (Si Es Necesario)</w:t>
+        <w:t xml:space="preserve">3.2 2. Desinstalar Instalaciones Previas</w:t>
       </w:r>
     </w:p>
     <w:p>
@@ -1262,13 +1262,13 @@
         <w:t xml:space="preserve">4. Instalación de Miniconda</w:t>
       </w:r>
     </w:p>
-    <w:bookmarkStart w:id="35" w:name="método-1-instalación-rápida-recomendado"/>
+    <w:bookmarkStart w:id="35" w:name="método-1-instalación-rápida"/>
     <w:p>
       <w:pPr>
         <w:pStyle w:val="Heading2"/>
       </w:pPr>
       <w:r>
-        <w:t xml:space="preserve">4.1 Método 1: Instalación Rápida (Recomendado)</w:t>
+        <w:t xml:space="preserve">4.1 Método 1: Instalación Rápida</w:t>
       </w:r>
     </w:p>
     <w:p>
@@ -1498,7 +1498,7 @@
           <w:b/>
           <w:bCs/>
         </w:rPr>
-        <w:t xml:space="preserve">opciones:</w:t>
+        <w:t xml:space="preserve">Opciones:</w:t>
       </w:r>
     </w:p>
     <w:p>
@@ -1761,6 +1761,36 @@
           <w:rStyle w:val="AttributeTok"/>
         </w:rPr>
         <w:t xml:space="preserve">--all</w:t>
+      </w:r>
+      <w:r>
+        <w:br/>
+      </w:r>
+      <w:r>
+        <w:br/>
+      </w:r>
+      <w:r>
+        <w:rPr>
+          <w:rStyle w:val="CommentTok"/>
+        </w:rPr>
+        <w:t xml:space="preserve"># O solo para fish</w:t>
+      </w:r>
+      <w:r>
+        <w:br/>
+      </w:r>
+      <w:r>
+        <w:br/>
+      </w:r>
+      <w:r>
+        <w:rPr>
+          <w:rStyle w:val="ExtensionTok"/>
+        </w:rPr>
+        <w:t xml:space="preserve">conda</w:t>
+      </w:r>
+      <w:r>
+        <w:rPr>
+          <w:rStyle w:val="NormalTok"/>
+        </w:rPr>
+        <w:t xml:space="preserve"> init fish</w:t>
       </w:r>
       <w:r>
         <w:br/>

</xml_diff>